<commit_message>
Add outreach materials; soften Karamoja claim in paper 2
Substack article (El Nino, seasons, heat, floods, NDP IV, food and water),
standalone X posts, credited social graphics and animations. Paper 2: rainfall
explains part of Karamoja's rising food insecurity, not all of it.

Co-Authored-By: Claude Opus 5.5 <noreply@anthropic.com>
</commit_message>
<xml_diff>
--- a/paper/uganda_growing_seasons_food_security.docx
+++ b/paper/uganda_growing_seasons_food_security.docx
@@ -141,7 +141,7 @@
         <w:t xml:space="preserve"> </w:t>
       </w:r>
       <w:r>
-        <w:t xml:space="preserve">Rainfall-based indices track vegetation weakly (r = 0.12–0.26) and national yields not at all. Karamoja’s IPC Phase 3+ share rose from 0% to 27–38% between 2011–2013 and 2021–2024 while its seasons improved.</w:t>
+        <w:t xml:space="preserve">Rainfall-based indices track vegetation weakly (r = 0.12–0.26) and national yields not at all. Karamoja’s IPC Phase 3+ share rose from 0% in 2011–2013 to 27–38% in 2021–2024. It rose in good rainy seasons (2019–2020) as well as poor ones (2021–2023), and vegetation condition was above its long-term average throughout 2019–2024.</w:t>
       </w:r>
     </w:p>
     <w:p>
@@ -3798,7 +3798,7 @@
         <w:t xml:space="preserve"> </w:t>
       </w:r>
       <w:r>
-        <w:t xml:space="preserve">The share of Karamoja IPC units in Phase 3 or worse rose from 0% in 2011–2013 to 27–38% in 2021–2024. Over the same years, Karamoja’s crop water stress fell and its vegetation condition improved. IPC status is unrelated to the preceding season’s WRSI failure (r = 0.10 with CHIRPS, −0.18 with ARC2, not significant). Its weak positive correlation with VCI (r = 0.31) reflects two opposite trends, not a causal link.</w:t>
+        <w:t xml:space="preserve">The share of Karamoja IPC units in Phase 3 or worse rose from 0% in 2011–2013 to 27–38% in 2021–2024. The rainy seasons over those years were mixed: good in 2018–2020 (maize WRSI 89–98) and poor in 2021–2023 (28–55), with 2022 a serious drought. Vegetation condition averaged 61 in 2019–2024 against 52 in 1982–2003. IPC status is unrelated to the preceding season’s WRSI failure (r = 0.10 with CHIRPS, −0.18 with ARC2, not significant). Its weak positive correlation with VCI (r = 0.31) reflects two opposite trends, not a causal link.</w:t>
       </w:r>
     </w:p>
     <w:bookmarkEnd w:id="45"/>
@@ -3912,13 +3912,13 @@
       </w:r>
     </w:p>
     <w:bookmarkEnd w:id="47"/>
-    <w:bookmarkStart w:id="48" w:name="X091a8d40b60921dfa302af6b0eccdd3452b0867"/>
+    <w:bookmarkStart w:id="48" w:name="X00e11b16467f935cfe81d57c030961c938a1b8c"/>
     <w:p>
       <w:pPr>
         <w:pStyle w:val="Heading3"/>
       </w:pPr>
       <w:r>
-        <w:t xml:space="preserve">6.2 Rainfall is not the main driver of recent food insecurity in Karamoja</w:t>
+        <w:t xml:space="preserve">6.2 Rainfall explains only part of Karamoja’s rising food insecurity</w:t>
       </w:r>
     </w:p>
     <w:p>
@@ -3926,7 +3926,7 @@
         <w:pStyle w:val="FirstParagraph"/>
       </w:pPr>
       <w:r>
-        <w:t xml:space="preserve">Karamoja’s IPC classifications worsened sharply after 2018, while its growing seasons became, if anything, more favourable. This is consistent with assessments that cite livestock losses, insecurity, pests and prices alongside climate. Early-warning systems that lean on rainfall-based crop indices would have missed this deterioration.</w:t>
+        <w:t xml:space="preserve">Karamoja’s IPC classifications worsened sharply after 2018. The poor seasons of 2021–2023 contributed, but the crisis was already rising in the good seasons of 2019–2020, and vegetation stayed above its long-term average. Rainfall explains part of the deterioration, not its persistence, which is consistent with assessments citing livestock losses, insecurity, pests and prices. Early-warning systems that lean on rainfall-based crop indices alone would have missed this.</w:t>
       </w:r>
     </w:p>
     <w:bookmarkEnd w:id="48"/>
@@ -4095,7 +4095,7 @@
         <w:t xml:space="preserve"> </w:t>
       </w:r>
       <w:r>
-        <w:t xml:space="preserve">The recent rise in acute food insecurity happened in improving seasons, so responses must go beyond climate.</w:t>
+        <w:t xml:space="preserve">The recent rise in acute food insecurity began in good rainy seasons and outlasted the 2021–2023 droughts, so responses must go beyond climate.</w:t>
       </w:r>
     </w:p>
     <w:p>
@@ -4175,7 +4175,7 @@
         </w:numPr>
       </w:pPr>
       <w:r>
-        <w:t xml:space="preserve">Rainfall-based crop indices track vegetation weakly and national yields not at all. Karamoja’s worsening food insecurity since 2018 is not explained by rainfall.</w:t>
+        <w:t xml:space="preserve">Rainfall-based crop indices track vegetation weakly and national yields not at all. Karamoja’s worsening food insecurity since 2018 is only partly explained by rainfall: it began in good seasons and persisted when vegetation was above average.</w:t>
       </w:r>
     </w:p>
     <w:bookmarkEnd w:id="52"/>

</xml_diff>